<commit_message>
New routes in doc
</commit_message>
<xml_diff>
--- a/API documentaion.docx
+++ b/API documentaion.docx
@@ -210,112 +210,181 @@
           <w:lang w:val="en-US"/>
         </w:rPr>
         <w:tab/>
-        <w:t>[PUT] – update information abou</w:t>
+        <w:t>[PUT] – update information about authors</w:t>
+      </w:r>
+    </w:p>
+    <w:p>
+      <w:pPr>
+        <w:rPr>
+          <w:lang w:val="en-US"/>
+        </w:rPr>
+      </w:pPr>
+      <w:r>
+        <w:rPr>
+          <w:lang w:val="en-US"/>
+        </w:rPr>
+        <w:tab/>
+        <w:t>[DELETE] – delete all authors of certain book</w:t>
+      </w:r>
+    </w:p>
+    <w:p>
+      <w:pPr>
+        <w:rPr>
+          <w:lang w:val="en-US"/>
+        </w:rPr>
+      </w:pPr>
+      <w:r>
+        <w:rPr>
+          <w:lang w:val="en-US"/>
+        </w:rPr>
+        <w:t>/books/{id}/topics</w:t>
+      </w:r>
+    </w:p>
+    <w:p>
+      <w:pPr>
+        <w:rPr>
+          <w:lang w:val="en-US"/>
+        </w:rPr>
+      </w:pPr>
+      <w:r>
+        <w:rPr>
+          <w:lang w:val="en-US"/>
+        </w:rPr>
+        <w:tab/>
+        <w:t>[GET] – get certain book topics information</w:t>
+      </w:r>
+    </w:p>
+    <w:p>
+      <w:pPr>
+        <w:rPr>
+          <w:lang w:val="en-US"/>
+        </w:rPr>
+      </w:pPr>
+      <w:r>
+        <w:rPr>
+          <w:lang w:val="en-US"/>
+        </w:rPr>
+        <w:tab/>
+        <w:t>[POST] – create topic about book</w:t>
+      </w:r>
+    </w:p>
+    <w:p>
+      <w:pPr>
+        <w:rPr>
+          <w:lang w:val="en-US"/>
+        </w:rPr>
+      </w:pPr>
+      <w:r>
+        <w:rPr>
+          <w:lang w:val="en-US"/>
+        </w:rPr>
+        <w:tab/>
+        <w:t>[PUT] – update information about topics</w:t>
+      </w:r>
+    </w:p>
+    <w:p>
+      <w:pPr>
+        <w:rPr>
+          <w:lang w:val="en-US"/>
+        </w:rPr>
+      </w:pPr>
+      <w:r>
+        <w:rPr>
+          <w:lang w:val="en-US"/>
+        </w:rPr>
+        <w:tab/>
+        <w:t>[DELETE] – delete some topics (id must be passed in request body)</w:t>
+      </w:r>
+    </w:p>
+    <w:p>
+      <w:pPr>
+        <w:rPr>
+          <w:lang w:val="en-US"/>
+        </w:rPr>
+      </w:pPr>
+      <w:r>
+        <w:rPr>
+          <w:lang w:val="en-US"/>
+        </w:rPr>
+        <w:t>/books/{id}/reviews</w:t>
+      </w:r>
+    </w:p>
+    <w:p>
+      <w:pPr>
+        <w:rPr>
+          <w:lang w:val="en-US"/>
+        </w:rPr>
+      </w:pPr>
+      <w:r>
+        <w:rPr>
+          <w:lang w:val="en-US"/>
+        </w:rPr>
+        <w:tab/>
+        <w:t>[GET] – get all reviews about book</w:t>
+      </w:r>
+    </w:p>
+    <w:p>
+      <w:pPr>
+        <w:rPr>
+          <w:lang w:val="en-US"/>
+        </w:rPr>
+      </w:pPr>
+      <w:r>
+        <w:rPr>
+          <w:lang w:val="en-US"/>
+        </w:rPr>
+        <w:tab/>
+        <w:t>[POST] – create review to some book</w:t>
+      </w:r>
+    </w:p>
+    <w:p>
+      <w:pPr>
+        <w:rPr>
+          <w:lang w:val="en-US"/>
+        </w:rPr>
+      </w:pPr>
+      <w:r>
+        <w:rPr>
+          <w:lang w:val="en-US"/>
+        </w:rPr>
+        <w:tab/>
+        <w:t>[PUT] – update information about reviews to some book</w:t>
+      </w:r>
+    </w:p>
+    <w:p>
+      <w:pPr>
+        <w:rPr>
+          <w:lang w:val="en-US"/>
+        </w:rPr>
+      </w:pPr>
+      <w:r>
+        <w:rPr>
+          <w:lang w:val="en-US"/>
+        </w:rPr>
+        <w:tab/>
+        <w:t>[DELETE] – delete reviews about some book</w:t>
+      </w:r>
+    </w:p>
+    <w:p>
+      <w:pPr>
+        <w:rPr>
+          <w:lang w:val="en-US"/>
+        </w:rPr>
+      </w:pPr>
+      <w:r>
+        <w:rPr>
+          <w:lang w:val="en-US"/>
+        </w:rPr>
+        <w:t>/books/{id}/genre</w:t>
+      </w:r>
+      <w:r>
+        <w:rPr>
+          <w:lang w:val="en-US"/>
+        </w:rPr>
+        <w:t>s</w:t>
       </w:r>
       <w:bookmarkStart w:id="0" w:name="_GoBack"/>
       <w:bookmarkEnd w:id="0"/>
-      <w:r>
-        <w:rPr>
-          <w:lang w:val="en-US"/>
-        </w:rPr>
-        <w:t>t authors</w:t>
-      </w:r>
-    </w:p>
-    <w:p>
-      <w:pPr>
-        <w:rPr>
-          <w:lang w:val="en-US"/>
-        </w:rPr>
-      </w:pPr>
-      <w:r>
-        <w:rPr>
-          <w:lang w:val="en-US"/>
-        </w:rPr>
-        <w:tab/>
-        <w:t>[DELETE] – delete all authors of certain book</w:t>
-      </w:r>
-    </w:p>
-    <w:p>
-      <w:pPr>
-        <w:rPr>
-          <w:lang w:val="en-US"/>
-        </w:rPr>
-      </w:pPr>
-      <w:r>
-        <w:rPr>
-          <w:lang w:val="en-US"/>
-        </w:rPr>
-        <w:t>/books/{id}/topics</w:t>
-      </w:r>
-    </w:p>
-    <w:p>
-      <w:pPr>
-        <w:rPr>
-          <w:lang w:val="en-US"/>
-        </w:rPr>
-      </w:pPr>
-      <w:r>
-        <w:rPr>
-          <w:lang w:val="en-US"/>
-        </w:rPr>
-        <w:tab/>
-        <w:t>[GET] – get certain book topics information</w:t>
-      </w:r>
-    </w:p>
-    <w:p>
-      <w:pPr>
-        <w:rPr>
-          <w:lang w:val="en-US"/>
-        </w:rPr>
-      </w:pPr>
-      <w:r>
-        <w:rPr>
-          <w:lang w:val="en-US"/>
-        </w:rPr>
-        <w:tab/>
-        <w:t>[POST] – create topic about book</w:t>
-      </w:r>
-    </w:p>
-    <w:p>
-      <w:pPr>
-        <w:rPr>
-          <w:lang w:val="en-US"/>
-        </w:rPr>
-      </w:pPr>
-      <w:r>
-        <w:rPr>
-          <w:lang w:val="en-US"/>
-        </w:rPr>
-        <w:tab/>
-        <w:t>[PUT] – update information about topics</w:t>
-      </w:r>
-    </w:p>
-    <w:p>
-      <w:pPr>
-        <w:rPr>
-          <w:lang w:val="en-US"/>
-        </w:rPr>
-      </w:pPr>
-      <w:r>
-        <w:rPr>
-          <w:lang w:val="en-US"/>
-        </w:rPr>
-        <w:tab/>
-        <w:t>[DELETE] – delete some topics (id must be passed in request body)</w:t>
-      </w:r>
-    </w:p>
-    <w:p>
-      <w:pPr>
-        <w:rPr>
-          <w:lang w:val="en-US"/>
-        </w:rPr>
-      </w:pPr>
-      <w:r>
-        <w:rPr>
-          <w:lang w:val="en-US"/>
-        </w:rPr>
-        <w:t>/books/{id}/reviews</w:t>
-      </w:r>
     </w:p>
     <w:p>
       <w:pPr>
@@ -331,11 +400,6 @@
       </w:r>
     </w:p>
     <w:p>
-      <w:pPr>
-        <w:rPr>
-          <w:lang w:val="en-US"/>
-        </w:rPr>
-      </w:pPr>
       <w:r>
         <w:rPr>
           <w:lang w:val="en-US"/>
@@ -368,6 +432,7 @@
         <w:rPr>
           <w:lang w:val="en-US"/>
         </w:rPr>
+        <w:lastRenderedPageBreak/>
         <w:t>/topics/{id}</w:t>
       </w:r>
     </w:p>
@@ -399,6 +464,9 @@
     </w:p>
     <w:p>
       <w:pPr>
+        <w:tabs>
+          <w:tab w:val="left" w:pos="2835"/>
+        </w:tabs>
         <w:rPr>
           <w:lang w:val="en-US"/>
         </w:rPr>
@@ -408,6 +476,38 @@
           <w:lang w:val="en-US"/>
         </w:rPr>
         <w:t>/users/{id}/topics</w:t>
+      </w:r>
+    </w:p>
+    <w:p>
+      <w:pPr>
+        <w:tabs>
+          <w:tab w:val="left" w:pos="2835"/>
+        </w:tabs>
+        <w:rPr>
+          <w:lang w:val="en-US"/>
+        </w:rPr>
+      </w:pPr>
+      <w:r>
+        <w:rPr>
+          <w:lang w:val="en-US"/>
+        </w:rPr>
+        <w:t>/authors</w:t>
+      </w:r>
+    </w:p>
+    <w:p>
+      <w:pPr>
+        <w:tabs>
+          <w:tab w:val="left" w:pos="2835"/>
+        </w:tabs>
+        <w:rPr>
+          <w:lang w:val="en-US"/>
+        </w:rPr>
+      </w:pPr>
+      <w:r>
+        <w:rPr>
+          <w:lang w:val="en-US"/>
+        </w:rPr>
+        <w:t>/authors/{id}/books</w:t>
       </w:r>
     </w:p>
     <w:p>

</xml_diff>